<commit_message>
Restore Chapter One missing excerpt
</commit_message>
<xml_diff>
--- a/public/journal/chapter-01-pollex-audit.docx
+++ b/public/journal/chapter-01-pollex-audit.docx
@@ -6,24 +6,40 @@
       <w:pPr>
         <w:pStyle w:val="ChapterHeading"/>
       </w:pPr>
+      <w:r>
+        <w:t>CHAPTER ONE | HO STABBED A FISH AT THE LAGOON WHEN HE HEARD IT</w:t>
+      </w:r>
+    </w:p>
+    <w:p>
+      <w:pPr>
+        <w:pStyle w:val="ManuscriptOpeningParagraph"/>
+      </w:pPr>
+      <w:r>
+        <w:t>It began with a rumble. Thinking it was his stomach, he ignored the sound until it grew and deepened into a tearing above. A giant hole peeled open over his tiny island.</w:t>
+      </w:r>
+    </w:p>
+    <w:p>
+      <w:pPr>
+        <w:pStyle w:val="ManuscriptBody"/>
+      </w:pPr>
+      <w:r>
+        <w:t>“</w:t>
+      </w:r>
       <w:proofErr w:type="spellStart"/>
       <w:r>
-        <w:t>p</w:t>
-      </w:r>
-      <w:r>
-        <w:t>CHAPTER</w:t>
+        <w:t>Auē</w:t>
       </w:r>
       <w:proofErr w:type="spellEnd"/>
       <w:r>
-        <w:t xml:space="preserve"> ONE | HO STABBED A FISH AT THE LAGOON WHEN HE HEARD IT</w:t>
-      </w:r>
-    </w:p>
-    <w:p>
-      <w:pPr>
-        <w:pStyle w:val="ManuscriptOpeningParagraph"/>
-      </w:pPr>
-      <w:r>
-        <w:t>It began with a rumble. Thinking it was his stomach, he ignored the sound until it grew and deepened into a tearing above. A giant hole peeled open over his tiny island.</w:t>
+        <w:t xml:space="preserve">!” Ho </w:t>
+      </w:r>
+      <w:proofErr w:type="spellStart"/>
+      <w:r>
+        <w:t>marveled</w:t>
+      </w:r>
+      <w:proofErr w:type="spellEnd"/>
+      <w:r>
+        <w:t xml:space="preserve"> at the wound in the sky, “Would you look at that?”</w:t>
       </w:r>
     </w:p>
     <w:p>
@@ -31,29 +47,8 @@
         <w:pStyle w:val="ManuscriptBody"/>
       </w:pPr>
       <w:r>
-        <w:t>“</w:t>
-      </w:r>
-      <w:proofErr w:type="spellStart"/>
-      <w:r>
-        <w:t>Auē</w:t>
-      </w:r>
-      <w:proofErr w:type="spellEnd"/>
-      <w:r>
-        <w:t xml:space="preserve">!” Ho </w:t>
-      </w:r>
-      <w:proofErr w:type="spellStart"/>
-      <w:r>
-        <w:t>marveled</w:t>
-      </w:r>
-      <w:proofErr w:type="spellEnd"/>
-      <w:r>
-        <w:t xml:space="preserve"> at the wound in the sky, “Would you look at that?”</w:t>
-      </w:r>
-    </w:p>
-    <w:p>
-      <w:pPr>
-        <w:pStyle w:val="ManuscriptBody"/>
-      </w:pPr>
+        <w:t xml:space="preserve">The void gaped wide. The dying moi at the end of his spear mouthed with it. Breakfast. </w:t>
+      </w:r>
       <w:r>
         <w:t>After so many days of waiting.</w:t>
       </w:r>

</xml_diff>

<commit_message>
Update chapter 01 journal entry
</commit_message>
<xml_diff>
--- a/public/journal/chapter-01-pollex-audit.docx
+++ b/public/journal/chapter-01-pollex-audit.docx
@@ -7,15 +7,40 @@
         <w:pStyle w:val="ChapterHeading"/>
       </w:pPr>
       <w:r>
-        <w:t>CHAPTER ONE | HO STABBED A FISH AT THE LAGOON WHEN HE HEARD IT</w:t>
-      </w:r>
+        <w:t>CHAPTER ONE</w:t>
+      </w:r>
+      <w:r/>
     </w:p>
     <w:p>
       <w:pPr>
         <w:pStyle w:val="ManuscriptOpeningParagraph"/>
       </w:pPr>
       <w:r>
-        <w:t>It began with a rumble. Thinking it was his stomach, he ignored the sound until it grew and deepened into a tearing above. A giant hole peeled open over his tiny island.</w:t>
+        <w:t>H</w:t>
+      </w:r>
+      <w:r>
+        <w:t>o</w:t>
+      </w:r>
+      <w:r>
+        <w:t xml:space="preserve"> </w:t>
+      </w:r>
+      <w:r>
+        <w:t>stabbed a fish at the lagoon when he heard it.</w:t>
+      </w:r>
+      <w:r>
+        <w:t xml:space="preserve"> </w:t>
+      </w:r>
+      <w:r>
+        <w:t>Believing</w:t>
+      </w:r>
+      <w:r>
+        <w:t xml:space="preserve"> </w:t>
+      </w:r>
+      <w:r>
+        <w:t>the disturbance</w:t>
+      </w:r>
+      <w:r>
+        <w:t xml:space="preserve"> his stomach, he ignored the sound until it grew and deepened into a tearing above. A giant hole peeled open over his tiny island.</w:t>
       </w:r>
     </w:p>
     <w:p>
@@ -31,7 +56,13 @@
       </w:r>
       <w:proofErr w:type="spellEnd"/>
       <w:r>
-        <w:t xml:space="preserve">!” Ho </w:t>
+        <w:t>!” H</w:t>
+      </w:r>
+      <w:r>
+        <w:t>e</w:t>
+      </w:r>
+      <w:r>
+        <w:t xml:space="preserve"> </w:t>
       </w:r>
       <w:proofErr w:type="spellStart"/>
       <w:r>
@@ -39,7 +70,13 @@
       </w:r>
       <w:proofErr w:type="spellEnd"/>
       <w:r>
-        <w:t xml:space="preserve"> at the wound in the sky, “Would you look at that?”</w:t>
+        <w:t xml:space="preserve"> at the wound</w:t>
+      </w:r>
+      <w:r>
+        <w:t>ed</w:t>
+      </w:r>
+      <w:r>
+        <w:t xml:space="preserve"> sky, “Would you look at that?”</w:t>
       </w:r>
     </w:p>
     <w:p>
@@ -66,7 +103,19 @@
       </w:r>
       <w:proofErr w:type="spellEnd"/>
       <w:r>
-        <w:t xml:space="preserve"> lights the ceiling of heavens warmly. A purple stain of dawn marks the dividing line between night and day.” And with his free hand he fingered round the hole deciding, “but something new has awoken up there.”</w:t>
+        <w:t xml:space="preserve"> lights the ceiling of heavens warmly. A purple stain of dawn marks the dividing line between night and day.” And with </w:t>
+      </w:r>
+      <w:r>
+        <w:t>a</w:t>
+      </w:r>
+      <w:r>
+        <w:t xml:space="preserve"> free hand fingered </w:t>
+      </w:r>
+      <w:r>
+        <w:t xml:space="preserve">the sky </w:t>
+      </w:r>
+      <w:r>
+        <w:t>round the hole deciding, “but something new has awoken up there.”</w:t>
       </w:r>
     </w:p>
     <w:p>
@@ -144,6 +193,7 @@
         <w:rPr>
           <w:i/>
         </w:rPr>
+        <w:lastRenderedPageBreak/>
         <w:t>Am I cursed now for even thinking it?</w:t>
       </w:r>
       <w:r>
@@ -180,7 +230,6 @@
         <w:pStyle w:val="ManuscriptBody"/>
       </w:pPr>
       <w:r>
-        <w:lastRenderedPageBreak/>
         <w:t xml:space="preserve">Reeling in his thoughts, he waded east closer to land, but stopped after a step—blinking, bewildered by what he </w:t>
       </w:r>
       <w:r>
@@ -257,7 +306,15 @@
         <w:pStyle w:val="ManuscriptBody"/>
       </w:pPr>
       <w:r>
-        <w:t>Swatting at it, Ho shifted his stance and called again into the hush, “Is it only you, god—or are the others coming? Must I share this fish?”</w:t>
+        <w:t xml:space="preserve">Swatting at it, Ho shifted his stance and called again into the hush, “Is it only you, </w:t>
+      </w:r>
+      <w:proofErr w:type="gramStart"/>
+      <w:r>
+        <w:t>god</w:t>
+      </w:r>
+      <w:proofErr w:type="gramEnd"/>
+      <w:r>
+        <w:t>—or are the others coming? Must I share this fish?”</w:t>
       </w:r>
     </w:p>
     <w:p>
@@ -1313,7 +1370,15 @@
       </w:r>
       <w:proofErr w:type="spellEnd"/>
       <w:r>
-        <w:t xml:space="preserve">. From what used to be Lapita. I saw you sail across the sky! Are you offspring of </w:t>
+        <w:t xml:space="preserve">. From what used to be Lapita. I saw you sail across the sky! Are </w:t>
+      </w:r>
+      <w:proofErr w:type="gramStart"/>
+      <w:r>
+        <w:t>you</w:t>
+      </w:r>
+      <w:proofErr w:type="gramEnd"/>
+      <w:r>
+        <w:t xml:space="preserve"> offspring of </w:t>
       </w:r>
       <w:proofErr w:type="spellStart"/>
       <w:r>
@@ -1529,7 +1594,15 @@
       </w:pPr>
       <w:r>
         <w:lastRenderedPageBreak/>
-        <w:t xml:space="preserve">The laughter stung. It whirlpooled in his ears, stirring a pride long dormant—shaming him the way only women could. </w:t>
+        <w:t xml:space="preserve">The laughter stung. It whirlpooled in his ears, stirring a pride long </w:t>
+      </w:r>
+      <w:proofErr w:type="gramStart"/>
+      <w:r>
+        <w:t>dormant—shaming</w:t>
+      </w:r>
+      <w:proofErr w:type="gramEnd"/>
+      <w:r>
+        <w:t xml:space="preserve"> him the way only women could. </w:t>
       </w:r>
       <w:r>
         <w:rPr>
@@ -1699,7 +1772,15 @@
         <w:pStyle w:val="ManuscriptBody"/>
       </w:pPr>
       <w:r>
-        <w:t xml:space="preserve">Spellbound by their mana, Ho caught himself grinning. Admiring the pair instead of readying for the attack. Eyes wide-set, unlike his, the colour of the deepest part of </w:t>
+        <w:t xml:space="preserve">Spellbound by their mana, Ho caught himself grinning. Admiring the pair instead of readying for the attack. Eyes </w:t>
+      </w:r>
+      <w:proofErr w:type="gramStart"/>
+      <w:r>
+        <w:t>wide-set</w:t>
+      </w:r>
+      <w:proofErr w:type="gramEnd"/>
+      <w:r>
+        <w:t xml:space="preserve">, unlike his, the colour of the deepest part of </w:t>
       </w:r>
       <w:proofErr w:type="spellStart"/>
       <w:r>
@@ -1846,7 +1927,15 @@
       </w:r>
       <w:proofErr w:type="spellEnd"/>
       <w:r>
-        <w:t xml:space="preserve">, birthing the flame of life itself. Something dormant, deep inside, had been exhumed and ignited by the demigod atop him. Ho wondered, </w:t>
+        <w:t xml:space="preserve">, birthing the flame of life itself. Something dormant, deep inside, had been exhumed and ignited by the demigod atop him. Ho </w:t>
+      </w:r>
+      <w:proofErr w:type="gramStart"/>
+      <w:r>
+        <w:t>wondered,</w:t>
+      </w:r>
+      <w:proofErr w:type="gramEnd"/>
+      <w:r>
+        <w:t xml:space="preserve"> </w:t>
       </w:r>
       <w:r>
         <w:rPr>

</xml_diff>